<commit_message>
docs: clarify Week 6 revise decision
Clarify that revise means continued model development rather than approval for deployment or shadow testing.

Synchronize the updated DOCX and PDF while preserving the six-page layout.
</commit_message>
<xml_diff>
--- a/coursework/week6/submission/Week_6_Model_Testing_and_Debugging_Report_Keith_Broussard.docx
+++ b/coursework/week6/submission/Week_6_Model_Testing_and_Debugging_Report_Keith_Broussard.docx
@@ -18,7 +18,6 @@
     </w:p>
     <w:p>
       <w:pPr>
-        <w:ind w:firstLine="0"/>
         <w:jc w:val="center"/>
       </w:pPr>
       <w:r>
@@ -27,7 +26,6 @@
     </w:p>
     <w:p>
       <w:pPr>
-        <w:ind w:firstLine="0"/>
         <w:jc w:val="center"/>
       </w:pPr>
       <w:r>
@@ -36,7 +34,6 @@
     </w:p>
     <w:p>
       <w:pPr>
-        <w:ind w:firstLine="0"/>
         <w:jc w:val="center"/>
       </w:pPr>
       <w:r>
@@ -45,7 +42,6 @@
     </w:p>
     <w:p>
       <w:pPr>
-        <w:ind w:firstLine="0"/>
         <w:jc w:val="center"/>
       </w:pPr>
       <w:r>
@@ -54,14 +50,13 @@
     </w:p>
     <w:p>
       <w:pPr>
-        <w:ind w:firstLine="0"/>
         <w:jc w:val="center"/>
       </w:pPr>
       <w:r>
         <w:t xml:space="preserve">August </w:t>
       </w:r>
       <w:r>
-        <w:t>8</w:t>
+        <w:t>9</w:t>
       </w:r>
       <w:r>
         <w:t>, 2026</w:t>
@@ -87,7 +82,7 @@
     </w:p>
     <w:p>
       <w:r>
-        <w:t>This Week 6 test evaluated whether a change in the probability threshold could improve urgent-message reliability without creating an unusable review burden. Nested cross-validation revealed a threshold failure rather than a deployable gain: 0.45 achieved 100% urgent recall only by labeling every message as urgent, while 0.50 missed most urgent examples. I froze the revise disposition before the preliminary holdout comparison, which repeated the tradeoff and did not change the decision.</w:t>
+        <w:t>Week 6 tested whether changing the probability threshold could improve urgent-message reliability without an unusable review burden. Nested cross-validation exposed a failure, not a deployable gain: 0.45 achieved 100% urgent recall by labeling every message urgent, while 0.50 missed most urgent messages. Before the holdout comparison, I froze the decision to revise the model rather than approve deployment or shadow testing. The holdout repeated this tradeoff and did not change the decision.</w:t>
       </w:r>
     </w:p>
     <w:p>
@@ -821,9 +816,19 @@
       </w:tr>
     </w:tbl>
     <w:p>
+      <w:pPr>
+        <w:pStyle w:val="Heading1"/>
+        <w:jc w:val="left"/>
+      </w:pPr>
       <w:r>
-        <w:br w:type="page"/>
+        <w:br/>
       </w:r>
+    </w:p>
+    <w:p>
+      <w:pPr>
+        <w:pStyle w:val="Heading1"/>
+        <w:jc w:val="left"/>
+      </w:pPr>
     </w:p>
     <w:p>
       <w:pPr>
@@ -954,7 +959,13 @@
         <w:t>compared with</w:t>
       </w:r>
       <w:r>
-        <w:t xml:space="preserve"> 0.128 for a constant prevalence probability. Because class weighting shifts probabilities, this is a calibration warning rather than proof that class weighting should be removed.</w:t>
+        <w:t xml:space="preserve"> 0.128 for a constant prevalence probability. The Brier result warrants calibration analysis </w:t>
+      </w:r>
+      <w:r>
+        <w:t>rather than</w:t>
+      </w:r>
+      <w:r>
+        <w:t xml:space="preserve"> removal of class weighting (Scikit-learn developers, n.d.-c).</w:t>
       </w:r>
     </w:p>
     <w:p>
@@ -995,7 +1006,7 @@
         <w:t>,</w:t>
       </w:r>
       <w:r>
-        <w:t xml:space="preserve"> and reserve an untouched test set. Third, preserve the notebook, aggregate metrics, error types, figures, and hashes without exporting message content or reviewer notes. Direct headings and consistent terminology also strengthen technical documentation (Google for Developers, n.d.).</w:t>
+        <w:t xml:space="preserve"> and reserve an untouched test set. Third, preserve the notebook, aggregate metrics, error types, figures, and hashes without exporting message content or reviewer notes. Direct headings and consistent terminology also strengthen technical documentation (Google for Developers, 2026).</w:t>
       </w:r>
     </w:p>
     <w:p>
@@ -1005,12 +1016,50 @@
     </w:p>
     <w:p>
       <w:r>
-        <w:t>The final disposition is revise, with no approval for deployment or shadow testing. False negatives can delay attention, while an all-urgent rule overwhelms the reviewer. The enriched sample does not estimate production prevalence, the holdout is not untouched, and protected demographic attributes are unavailable. I therefore cannot claim production reliability or demographic fairness. Human review remains required. Next, I would expand urgent examples, register review burden, test calibration inside nested validation, and reserve a new grouped test set.</w:t>
+        <w:t>The final decision remains revise, with no approval for deployment or shadow testing. False negatives can delay attention, while an all-urgent rule overwhelms the reviewer. The enriched sample does not estimate production prevalence, the holdout is not untouched, and protected demographic attributes are unavailable. I therefore cannot claim production reliability or demographic fairness. Human review remains required. Next, I would expand urgent examples, register review burden, test calibration inside nested validation, and reserve a new grouped test set.</w:t>
       </w:r>
     </w:p>
     <w:p>
       <w:pPr>
         <w:pStyle w:val="Heading1"/>
+      </w:pPr>
+      <w:r>
+        <w:t>AI Use Disclosure</w:t>
+      </w:r>
+    </w:p>
+    <w:p>
+      <w:pPr>
+        <w:rPr>
+          <w:b/>
+          <w:bCs/>
+        </w:rPr>
+      </w:pPr>
+      <w:r>
+        <w:t xml:space="preserve">I employed OpenAI Codex to assist </w:t>
+      </w:r>
+      <w:r>
+        <w:t>with</w:t>
+      </w:r>
+      <w:r>
+        <w:t xml:space="preserve"> o</w:t>
+      </w:r>
+      <w:r>
+        <w:t>rganizing</w:t>
+      </w:r>
+      <w:r>
+        <w:t xml:space="preserve"> the repository, as well as </w:t>
+      </w:r>
+      <w:r>
+        <w:t>with</w:t>
+      </w:r>
+      <w:r>
+        <w:t xml:space="preserve"> coding, grammar checking, and verifying experimental results. I conducted a thorough final review, made all pertinent decisions, and assume full responsibility for this submission.</w:t>
+      </w:r>
+    </w:p>
+    <w:p>
+      <w:pPr>
+        <w:pStyle w:val="Heading1"/>
+        <w:pageBreakBefore/>
       </w:pPr>
       <w:r>
         <w:t>References</w:t>
@@ -1021,24 +1070,7 @@
         <w:pStyle w:val="Reference"/>
       </w:pPr>
       <w:r>
-        <w:t xml:space="preserve">Course instructor. (2026). </w:t>
-      </w:r>
-      <w:r>
-        <w:rPr>
-          <w:i/>
-        </w:rPr>
-        <w:t>Week 6: Testing, evaluation &amp; documentation</w:t>
-      </w:r>
-      <w:r>
-        <w:t xml:space="preserve"> [Course assignment]. MSAI-699 Capstone.</w:t>
-      </w:r>
-    </w:p>
-    <w:p>
-      <w:pPr>
-        <w:pStyle w:val="Reference"/>
-      </w:pPr>
-      <w:r>
-        <w:t xml:space="preserve">Google for Developers. (n.d.). </w:t>
+        <w:t xml:space="preserve">Google for Developers. (2026, April 27). </w:t>
       </w:r>
       <w:r>
         <w:rPr>
@@ -1117,8 +1149,25 @@
         <w:t xml:space="preserve"> </w:t>
       </w:r>
     </w:p>
+    <w:p>
+      <w:pPr>
+        <w:pStyle w:val="Reference"/>
+      </w:pPr>
+      <w:r>
+        <w:t xml:space="preserve">Scikit-learn developers. (n.d.-c). Probability calibration. </w:t>
+      </w:r>
+      <w:hyperlink r:id="rId12">
+        <w:r>
+          <w:rPr>
+            <w:rFonts w:eastAsia="Times New Roman"/>
+            <w:u w:val="single"/>
+          </w:rPr>
+          <w:t>https://scikit-learn.org/stable/modules/calibration.html</w:t>
+        </w:r>
+      </w:hyperlink>
+    </w:p>
     <w:sectPr>
-      <w:headerReference w:type="default" r:id="rId12"/>
+      <w:headerReference w:type="default" r:id="rId13"/>
       <w:pgSz w:w="12240" w:h="15840"/>
       <w:pgMar w:top="1440" w:right="1440" w:bottom="1440" w:left="1440" w:header="720" w:footer="720" w:gutter="0"/>
       <w:cols w:space="720"/>

</xml_diff>